<commit_message>
ya funciona la optimizacion que hice, solo estaba en que el autoload no lo tenia asi que tocaba actualizar con codigo y cargarlo
</commit_message>
<xml_diff>
--- a/Ideas para la reserva.docx
+++ b/Ideas para la reserva.docx
@@ -386,37 +386,63 @@
         </w:rPr>
         <w:t xml:space="preserve"> </w:t>
       </w:r>
+      <w:r>
+        <w:rPr>
+          <w:color w:val="EE0000"/>
+          <w:lang w:val="es-ES"/>
+        </w:rPr>
+        <w:t>-- preguntarle</w:t>
+      </w:r>
+      <w:r>
+        <w:rPr>
+          <w:color w:val="EE0000"/>
+          <w:lang w:val="es-ES"/>
+        </w:rPr>
+        <w:t xml:space="preserve"> a la </w:t>
+      </w:r>
+      <w:proofErr w:type="spellStart"/>
+      <w:r>
+        <w:rPr>
+          <w:color w:val="EE0000"/>
+          <w:lang w:val="es-ES"/>
+        </w:rPr>
+        <w:t>lili</w:t>
+      </w:r>
+      <w:proofErr w:type="spellEnd"/>
+      <w:r>
+        <w:rPr>
+          <w:color w:val="EE0000"/>
+          <w:lang w:val="es-ES"/>
+        </w:rPr>
+        <w:t xml:space="preserve"> si en ella las boletas de los hoteles las dan al final o pueden darse adelantado </w:t>
+      </w:r>
       <w:proofErr w:type="gramStart"/>
       <w:r>
         <w:rPr>
           <w:color w:val="EE0000"/>
           <w:lang w:val="es-ES"/>
         </w:rPr>
-        <w:t>--  preguntarle</w:t>
+        <w:t>¿</w:t>
+      </w:r>
+      <w:r>
+        <w:rPr>
+          <w:color w:val="EE0000"/>
+          <w:lang w:val="es-ES"/>
+        </w:rPr>
+        <w:t xml:space="preserve"> </w:t>
+      </w:r>
+      <w:r>
+        <w:rPr>
+          <w:lang w:val="es-ES"/>
+        </w:rPr>
+        <w:t>al</w:t>
       </w:r>
       <w:proofErr w:type="gramEnd"/>
       <w:r>
         <w:rPr>
-          <w:color w:val="EE0000"/>
-          <w:lang w:val="es-ES"/>
-        </w:rPr>
-        <w:t xml:space="preserve"> a la </w:t>
-      </w:r>
-      <w:proofErr w:type="spellStart"/>
-      <w:r>
-        <w:rPr>
-          <w:color w:val="EE0000"/>
-          <w:lang w:val="es-ES"/>
-        </w:rPr>
-        <w:t>lili</w:t>
-      </w:r>
-      <w:proofErr w:type="spellEnd"/>
-      <w:r>
-        <w:rPr>
-          <w:color w:val="EE0000"/>
-          <w:lang w:val="es-ES"/>
-        </w:rPr>
-        <w:t xml:space="preserve"> si en ella las boletas de los hoteles las dan al final o pueden darse adelantado ¿</w:t>
+          <w:lang w:val="es-ES"/>
+        </w:rPr>
+        <w:t xml:space="preserve"> final se realiza </w:t>
       </w:r>
     </w:p>
     <w:p>
@@ -478,6 +504,7 @@
       </w:pPr>
       <w:r>
         <w:rPr>
+          <w:noProof/>
           <w:lang w:val="es-ES"/>
         </w:rPr>
         <w:lastRenderedPageBreak/>
@@ -531,6 +558,7 @@
       </w:pPr>
       <w:r>
         <w:rPr>
+          <w:noProof/>
           <w:lang w:val="es-ES"/>
         </w:rPr>
         <w:drawing>
@@ -583,6 +611,7 @@
       </w:pPr>
       <w:r>
         <w:rPr>
+          <w:noProof/>
           <w:lang w:val="es-ES"/>
         </w:rPr>
         <w:lastRenderedPageBreak/>
@@ -751,6 +780,7 @@
       </w:pPr>
       <w:r>
         <w:rPr>
+          <w:noProof/>
           <w:lang w:val="es-ES"/>
         </w:rPr>
         <w:drawing>

</xml_diff>

<commit_message>
se ha agregado el fronted ver detaller y un modal para la confircmacion de la cancelacionademas de que eliminamos pla comuna tootal de la tabla y agregamos tres puntitos en la tabla
</commit_message>
<xml_diff>
--- a/Ideas para la reserva.docx
+++ b/Ideas para la reserva.docx
@@ -121,6 +121,12 @@
         <w:rPr>
           <w:lang w:val="es-US"/>
         </w:rPr>
+        <w:t xml:space="preserve">(solo botón) </w:t>
+      </w:r>
+      <w:r>
+        <w:rPr>
+          <w:lang w:val="es-US"/>
+        </w:rPr>
         <w:t xml:space="preserve">Marcar ausente y planeo que al marcar ausente </w:t>
       </w:r>
       <w:proofErr w:type="spellStart"/>
@@ -167,6 +173,26 @@
         <w:rPr>
           <w:lang w:val="es-US"/>
         </w:rPr>
+        <w:t xml:space="preserve">(este si </w:t>
+      </w:r>
+      <w:proofErr w:type="spellStart"/>
+      <w:r>
+        <w:rPr>
+          <w:lang w:val="es-US"/>
+        </w:rPr>
+        <w:t>seria</w:t>
+      </w:r>
+      <w:proofErr w:type="spellEnd"/>
+      <w:r>
+        <w:rPr>
+          <w:lang w:val="es-US"/>
+        </w:rPr>
+        <w:t xml:space="preserve"> un nuevo modal) </w:t>
+      </w:r>
+      <w:r>
+        <w:rPr>
+          <w:lang w:val="es-US"/>
+        </w:rPr>
         <w:t xml:space="preserve">Ver </w:t>
       </w:r>
       <w:proofErr w:type="gramStart"/>
@@ -210,6 +236,84 @@
           <w:lang w:val="es-US"/>
         </w:rPr>
         <w:t xml:space="preserve"> completamente la información de la reserva </w:t>
+      </w:r>
+      <w:r>
+        <w:rPr>
+          <w:lang w:val="es-US"/>
+        </w:rPr>
+        <w:t>Un historial el cual mostrara las acciones que se realizaron n esa reserva,</w:t>
+      </w:r>
+      <w:r>
+        <w:rPr>
+          <w:lang w:val="es-US"/>
+        </w:rPr>
+        <w:t xml:space="preserve"> ambos se </w:t>
+      </w:r>
+      <w:proofErr w:type="spellStart"/>
+      <w:r>
+        <w:rPr>
+          <w:lang w:val="es-US"/>
+        </w:rPr>
+        <w:t>ufiican</w:t>
+      </w:r>
+      <w:proofErr w:type="spellEnd"/>
+      <w:r>
+        <w:rPr>
+          <w:lang w:val="es-US"/>
+        </w:rPr>
+        <w:t xml:space="preserve">, y creo en la </w:t>
+      </w:r>
+      <w:proofErr w:type="spellStart"/>
+      <w:r>
+        <w:rPr>
+          <w:lang w:val="es-US"/>
+        </w:rPr>
+        <w:t>dercha</w:t>
+      </w:r>
+      <w:proofErr w:type="spellEnd"/>
+      <w:r>
+        <w:rPr>
+          <w:lang w:val="es-US"/>
+        </w:rPr>
+        <w:t xml:space="preserve"> los detalles y en la izquierda el historial utilizando </w:t>
+      </w:r>
+      <w:r>
+        <w:t>Timeline</w:t>
+      </w:r>
+      <w:r>
+        <w:t xml:space="preserve"> de manera horizontal para el </w:t>
+      </w:r>
+      <w:proofErr w:type="spellStart"/>
+      <w:r>
+        <w:t>hstorial</w:t>
+      </w:r>
+      <w:proofErr w:type="spellEnd"/>
+      <w:r>
+        <w:t xml:space="preserve">, además agregaremos otro </w:t>
+      </w:r>
+      <w:proofErr w:type="spellStart"/>
+      <w:r>
+        <w:t>aapartados</w:t>
+      </w:r>
+      <w:proofErr w:type="spellEnd"/>
+      <w:r>
+        <w:t xml:space="preserve"> para documentos como los comprobantes y facturas, además dará la </w:t>
+      </w:r>
+      <w:proofErr w:type="spellStart"/>
+      <w:r>
+        <w:t>opcoion</w:t>
+      </w:r>
+      <w:proofErr w:type="spellEnd"/>
+      <w:r>
+        <w:t xml:space="preserve"> de enviar por correo o imprimir el </w:t>
+      </w:r>
+      <w:proofErr w:type="spellStart"/>
+      <w:r>
+        <w:t>comprbante</w:t>
+      </w:r>
+      <w:proofErr w:type="spellEnd"/>
+      <w:r>
+        <w:t>,</w:t>
       </w:r>
     </w:p>
     <w:p>
@@ -224,10 +328,827 @@
         </w:rPr>
       </w:pPr>
       <w:r>
-        <w:rPr>
-          <w:lang w:val="es-US"/>
-        </w:rPr>
-        <w:t>Un historial el cual mostrara las acciones que se realizaron n esa reserva,</w:t>
+        <w:t xml:space="preserve">Usar </w:t>
+      </w:r>
+      <w:proofErr w:type="spellStart"/>
+      <w:r>
+        <w:rPr>
+          <w:b/>
+          <w:bCs/>
+        </w:rPr>
+        <w:t>PHPMailer</w:t>
+      </w:r>
+      <w:proofErr w:type="spellEnd"/>
+      <w:r>
+        <w:rPr>
+          <w:b/>
+          <w:bCs/>
+        </w:rPr>
+        <w:t xml:space="preserve"> para el </w:t>
+      </w:r>
+      <w:proofErr w:type="spellStart"/>
+      <w:r>
+        <w:rPr>
+          <w:b/>
+          <w:bCs/>
+        </w:rPr>
+        <w:t>envio</w:t>
+      </w:r>
+      <w:proofErr w:type="spellEnd"/>
+      <w:r>
+        <w:rPr>
+          <w:b/>
+          <w:bCs/>
+        </w:rPr>
+        <w:t xml:space="preserve"> de correos</w:t>
+      </w:r>
+    </w:p>
+    <w:p>
+      <w:pPr>
+        <w:pStyle w:val="Prrafodelista"/>
+        <w:ind w:left="1440" w:firstLine="0"/>
+      </w:pPr>
+      <w:proofErr w:type="spellStart"/>
+      <w:r>
+        <w:t>aqui</w:t>
+      </w:r>
+      <w:proofErr w:type="spellEnd"/>
+      <w:r>
+        <w:t xml:space="preserve"> en </w:t>
+      </w:r>
+      <w:proofErr w:type="spellStart"/>
+      <w:r>
+        <w:t>verdetalles</w:t>
+      </w:r>
+      <w:proofErr w:type="spellEnd"/>
+      <w:r>
+        <w:t xml:space="preserve"> se mostrara todo en detalle de la reserva realizada todo es decir todo los datos de la reserva, el cual seria un apartado de </w:t>
+      </w:r>
+      <w:proofErr w:type="spellStart"/>
+      <w:r>
+        <w:t>info</w:t>
+      </w:r>
+      <w:proofErr w:type="spellEnd"/>
+      <w:r>
+        <w:t xml:space="preserve">, eso en el lado derecho, y en el lado </w:t>
+      </w:r>
+      <w:proofErr w:type="spellStart"/>
+      <w:r>
+        <w:t>izqierdo</w:t>
+      </w:r>
+      <w:proofErr w:type="spellEnd"/>
+      <w:r>
+        <w:t xml:space="preserve"> pensaba colocar un </w:t>
+      </w:r>
+      <w:proofErr w:type="spellStart"/>
+      <w:r>
+        <w:t>ihstorial</w:t>
+      </w:r>
+      <w:proofErr w:type="spellEnd"/>
+      <w:r>
+        <w:t xml:space="preserve"> el cual se mostrara usando </w:t>
+      </w:r>
+      <w:r>
+        <w:t>Timeline</w:t>
+      </w:r>
+      <w:r>
+        <w:t xml:space="preserve"> de manera </w:t>
+      </w:r>
+      <w:r>
+        <w:t>vertical</w:t>
+      </w:r>
+      <w:r>
+        <w:t xml:space="preserve"> mostrando el </w:t>
+      </w:r>
+      <w:proofErr w:type="spellStart"/>
+      <w:r>
+        <w:t>historail</w:t>
+      </w:r>
+      <w:proofErr w:type="spellEnd"/>
+      <w:r>
+        <w:t xml:space="preserve"> es decir la fecha en que se </w:t>
+      </w:r>
+      <w:proofErr w:type="spellStart"/>
+      <w:r>
+        <w:t>relaizo</w:t>
+      </w:r>
+      <w:proofErr w:type="spellEnd"/>
+      <w:r>
+        <w:t xml:space="preserve"> </w:t>
+      </w:r>
+      <w:proofErr w:type="spellStart"/>
+      <w:r>
+        <w:t>laopcion</w:t>
+      </w:r>
+      <w:proofErr w:type="spellEnd"/>
+      <w:r>
+        <w:t xml:space="preserve"> por ejemplo lo primero la reserva se realizo primero que salga la fecha y debajo la descripción de ejemplo reserva realizada, y </w:t>
+      </w:r>
+      <w:proofErr w:type="spellStart"/>
+      <w:r>
+        <w:t>asi</w:t>
+      </w:r>
+      <w:proofErr w:type="spellEnd"/>
+      <w:r>
+        <w:t xml:space="preserve"> para cada opción como por ejemplo al hacer </w:t>
+      </w:r>
+      <w:proofErr w:type="spellStart"/>
+      <w:r>
+        <w:t>checkin</w:t>
+      </w:r>
+      <w:proofErr w:type="spellEnd"/>
+      <w:r>
+        <w:t xml:space="preserve"> , </w:t>
+      </w:r>
+      <w:proofErr w:type="spellStart"/>
+      <w:r>
+        <w:t>checkin</w:t>
+      </w:r>
+      <w:proofErr w:type="spellEnd"/>
+      <w:r>
+        <w:t xml:space="preserve"> confirmado o entrada </w:t>
+      </w:r>
+      <w:proofErr w:type="spellStart"/>
+      <w:r>
+        <w:t>cofirmada</w:t>
+      </w:r>
+      <w:proofErr w:type="spellEnd"/>
+      <w:r>
+        <w:t xml:space="preserve">, </w:t>
+      </w:r>
+      <w:r>
+        <w:t xml:space="preserve">siendo esta la tabla CREATE TABLE CREATE TABLE </w:t>
+      </w:r>
+      <w:proofErr w:type="spellStart"/>
+      <w:r>
+        <w:t>reserva_historial</w:t>
+      </w:r>
+      <w:proofErr w:type="spellEnd"/>
+      <w:r>
+        <w:t xml:space="preserve"> (</w:t>
+      </w:r>
+    </w:p>
+    <w:p>
+      <w:pPr>
+        <w:pStyle w:val="Prrafodelista"/>
+        <w:ind w:left="1440" w:firstLine="0"/>
+      </w:pPr>
+      <w:r>
+        <w:t xml:space="preserve">    --- Identificador único del registro de historial</w:t>
+      </w:r>
+    </w:p>
+    <w:p>
+      <w:pPr>
+        <w:pStyle w:val="Prrafodelista"/>
+        <w:ind w:left="1440" w:firstLine="0"/>
+        <w:rPr>
+          <w:lang w:val="en-US"/>
+        </w:rPr>
+      </w:pPr>
+      <w:r>
+        <w:t xml:space="preserve">    </w:t>
+      </w:r>
+      <w:r>
+        <w:rPr>
+          <w:lang w:val="en-US"/>
+        </w:rPr>
+        <w:t>id INT AUTO_INCREMENT PRIMARY KEY,</w:t>
+      </w:r>
+    </w:p>
+    <w:p>
+      <w:pPr>
+        <w:pStyle w:val="Prrafodelista"/>
+        <w:ind w:left="1440" w:firstLine="0"/>
+        <w:rPr>
+          <w:lang w:val="en-US"/>
+        </w:rPr>
+      </w:pPr>
+    </w:p>
+    <w:p>
+      <w:pPr>
+        <w:pStyle w:val="Prrafodelista"/>
+        <w:ind w:left="1440" w:firstLine="0"/>
+      </w:pPr>
+      <w:r>
+        <w:rPr>
+          <w:lang w:val="en-US"/>
+        </w:rPr>
+        <w:t xml:space="preserve">    </w:t>
+      </w:r>
+      <w:r>
+        <w:t>--- ID de la reserva relacionada (FK lógica a tabla reservas)</w:t>
+      </w:r>
+    </w:p>
+    <w:p>
+      <w:pPr>
+        <w:pStyle w:val="Prrafodelista"/>
+        <w:ind w:left="1440" w:firstLine="0"/>
+        <w:rPr>
+          <w:lang w:val="en-US"/>
+        </w:rPr>
+      </w:pPr>
+      <w:r>
+        <w:t xml:space="preserve">    </w:t>
+      </w:r>
+      <w:proofErr w:type="spellStart"/>
+      <w:r>
+        <w:rPr>
+          <w:lang w:val="en-US"/>
+        </w:rPr>
+        <w:t>id_reserva</w:t>
+      </w:r>
+      <w:proofErr w:type="spellEnd"/>
+      <w:r>
+        <w:rPr>
+          <w:lang w:val="en-US"/>
+        </w:rPr>
+        <w:t xml:space="preserve"> INT NOT NULL,</w:t>
+      </w:r>
+    </w:p>
+    <w:p>
+      <w:pPr>
+        <w:pStyle w:val="Prrafodelista"/>
+        <w:ind w:left="1440" w:firstLine="0"/>
+        <w:rPr>
+          <w:lang w:val="en-US"/>
+        </w:rPr>
+      </w:pPr>
+    </w:p>
+    <w:p>
+      <w:pPr>
+        <w:pStyle w:val="Prrafodelista"/>
+        <w:ind w:left="1440" w:firstLine="0"/>
+      </w:pPr>
+      <w:r>
+        <w:rPr>
+          <w:lang w:val="en-US"/>
+        </w:rPr>
+        <w:t xml:space="preserve">    </w:t>
+      </w:r>
+      <w:r>
+        <w:t>--- Tipo de evento realizado sobre la reserva</w:t>
+      </w:r>
+    </w:p>
+    <w:p>
+      <w:pPr>
+        <w:pStyle w:val="Prrafodelista"/>
+        <w:ind w:left="1440" w:firstLine="0"/>
+      </w:pPr>
+      <w:r>
+        <w:t xml:space="preserve">    --- Ejemplos: CREACION, EDICION, CHECK_IN, CHECK_OUT, CANCELACION, NO_SHOW, PAGO, COMPROBANTE, PENALIDAD</w:t>
+      </w:r>
+    </w:p>
+    <w:p>
+      <w:pPr>
+        <w:pStyle w:val="Prrafodelista"/>
+        <w:ind w:left="1440" w:firstLine="0"/>
+      </w:pPr>
+      <w:r>
+        <w:t xml:space="preserve">    tipo </w:t>
+      </w:r>
+      <w:proofErr w:type="gramStart"/>
+      <w:r>
+        <w:t>VARCHAR(</w:t>
+      </w:r>
+      <w:proofErr w:type="gramEnd"/>
+      <w:r>
+        <w:t>30) NOT NULL,</w:t>
+      </w:r>
+    </w:p>
+    <w:p>
+      <w:pPr>
+        <w:pStyle w:val="Prrafodelista"/>
+        <w:ind w:left="1440" w:firstLine="0"/>
+      </w:pPr>
+    </w:p>
+    <w:p>
+      <w:pPr>
+        <w:pStyle w:val="Prrafodelista"/>
+        <w:ind w:left="1440" w:firstLine="0"/>
+      </w:pPr>
+      <w:r>
+        <w:t xml:space="preserve">    --- Descripción detallada de la acción realizada</w:t>
+      </w:r>
+    </w:p>
+    <w:p>
+      <w:pPr>
+        <w:pStyle w:val="Prrafodelista"/>
+        <w:ind w:left="1440" w:firstLine="0"/>
+      </w:pPr>
+      <w:r>
+        <w:t xml:space="preserve">    --- Ejemplo: "Reserva cancelada con penalidad del 25%"</w:t>
+      </w:r>
+    </w:p>
+    <w:p>
+      <w:pPr>
+        <w:pStyle w:val="Prrafodelista"/>
+        <w:ind w:left="1440" w:firstLine="0"/>
+      </w:pPr>
+      <w:r>
+        <w:t xml:space="preserve">    </w:t>
+      </w:r>
+      <w:proofErr w:type="spellStart"/>
+      <w:r>
+        <w:t>descripcion</w:t>
+      </w:r>
+      <w:proofErr w:type="spellEnd"/>
+      <w:r>
+        <w:t xml:space="preserve"> TEXT NOT NULL,</w:t>
+      </w:r>
+    </w:p>
+    <w:p>
+      <w:pPr>
+        <w:pStyle w:val="Prrafodelista"/>
+        <w:ind w:left="1440" w:firstLine="0"/>
+      </w:pPr>
+    </w:p>
+    <w:p>
+      <w:pPr>
+        <w:pStyle w:val="Prrafodelista"/>
+        <w:ind w:left="1440" w:firstLine="0"/>
+      </w:pPr>
+      <w:r>
+        <w:t xml:space="preserve">    --- Estado anterior de la reserva (opcional)</w:t>
+      </w:r>
+    </w:p>
+    <w:p>
+      <w:pPr>
+        <w:pStyle w:val="Prrafodelista"/>
+        <w:ind w:left="1440" w:firstLine="0"/>
+      </w:pPr>
+      <w:r>
+        <w:t xml:space="preserve">    --- Ejemplo: CONFIRMADA</w:t>
+      </w:r>
+    </w:p>
+    <w:p>
+      <w:pPr>
+        <w:pStyle w:val="Prrafodelista"/>
+        <w:ind w:left="1440" w:firstLine="0"/>
+      </w:pPr>
+      <w:r>
+        <w:t xml:space="preserve">    </w:t>
+      </w:r>
+      <w:proofErr w:type="spellStart"/>
+      <w:r>
+        <w:t>estado_anterior</w:t>
+      </w:r>
+      <w:proofErr w:type="spellEnd"/>
+      <w:r>
+        <w:t xml:space="preserve"> </w:t>
+      </w:r>
+      <w:proofErr w:type="gramStart"/>
+      <w:r>
+        <w:t>VARCHAR(</w:t>
+      </w:r>
+      <w:proofErr w:type="gramEnd"/>
+      <w:r>
+        <w:t>30) NULL,</w:t>
+      </w:r>
+    </w:p>
+    <w:p>
+      <w:pPr>
+        <w:pStyle w:val="Prrafodelista"/>
+        <w:ind w:left="1440" w:firstLine="0"/>
+      </w:pPr>
+    </w:p>
+    <w:p>
+      <w:pPr>
+        <w:pStyle w:val="Prrafodelista"/>
+        <w:ind w:left="1440" w:firstLine="0"/>
+      </w:pPr>
+      <w:r>
+        <w:t xml:space="preserve">    --- Estado nuevo de la reserva (opcional)</w:t>
+      </w:r>
+    </w:p>
+    <w:p>
+      <w:pPr>
+        <w:pStyle w:val="Prrafodelista"/>
+        <w:ind w:left="1440" w:firstLine="0"/>
+      </w:pPr>
+      <w:r>
+        <w:t xml:space="preserve">    --- Ejemplo: CANCELADA</w:t>
+      </w:r>
+    </w:p>
+    <w:p>
+      <w:pPr>
+        <w:pStyle w:val="Prrafodelista"/>
+        <w:ind w:left="1440" w:firstLine="0"/>
+      </w:pPr>
+      <w:r>
+        <w:t xml:space="preserve">    </w:t>
+      </w:r>
+      <w:proofErr w:type="spellStart"/>
+      <w:r>
+        <w:t>estado_nuevo</w:t>
+      </w:r>
+      <w:proofErr w:type="spellEnd"/>
+      <w:r>
+        <w:t xml:space="preserve"> </w:t>
+      </w:r>
+      <w:proofErr w:type="gramStart"/>
+      <w:r>
+        <w:t>VARCHAR(</w:t>
+      </w:r>
+      <w:proofErr w:type="gramEnd"/>
+      <w:r>
+        <w:t>30) NULL,</w:t>
+      </w:r>
+    </w:p>
+    <w:p>
+      <w:pPr>
+        <w:pStyle w:val="Prrafodelista"/>
+        <w:ind w:left="1440" w:firstLine="0"/>
+      </w:pPr>
+    </w:p>
+    <w:p>
+      <w:pPr>
+        <w:pStyle w:val="Prrafodelista"/>
+        <w:ind w:left="1440" w:firstLine="0"/>
+      </w:pPr>
+      <w:r>
+        <w:t xml:space="preserve">    --- Monto relacionado al evento (opcional)</w:t>
+      </w:r>
+    </w:p>
+    <w:p>
+      <w:pPr>
+        <w:pStyle w:val="Prrafodelista"/>
+        <w:ind w:left="1440" w:firstLine="0"/>
+      </w:pPr>
+      <w:r>
+        <w:t xml:space="preserve">    --- Ejemplo: penalidad, pago, devolución parcial</w:t>
+      </w:r>
+    </w:p>
+    <w:p>
+      <w:pPr>
+        <w:pStyle w:val="Prrafodelista"/>
+        <w:ind w:left="1440" w:firstLine="0"/>
+      </w:pPr>
+      <w:r>
+        <w:t xml:space="preserve">    monto </w:t>
+      </w:r>
+      <w:proofErr w:type="gramStart"/>
+      <w:r>
+        <w:t>DECIMAL(</w:t>
+      </w:r>
+      <w:proofErr w:type="gramEnd"/>
+      <w:r>
+        <w:t>10,2) NULL,</w:t>
+      </w:r>
+    </w:p>
+    <w:p>
+      <w:pPr>
+        <w:pStyle w:val="Prrafodelista"/>
+        <w:ind w:left="1440" w:firstLine="0"/>
+      </w:pPr>
+    </w:p>
+    <w:p>
+      <w:pPr>
+        <w:pStyle w:val="Prrafodelista"/>
+        <w:ind w:left="1440" w:firstLine="0"/>
+      </w:pPr>
+      <w:r>
+        <w:t xml:space="preserve">    --- Usuario que realizó la acción (</w:t>
+      </w:r>
+      <w:proofErr w:type="spellStart"/>
+      <w:r>
+        <w:t>admin</w:t>
+      </w:r>
+      <w:proofErr w:type="spellEnd"/>
+      <w:r>
+        <w:t>, recepcionista, sistema)</w:t>
+      </w:r>
+    </w:p>
+    <w:p>
+      <w:pPr>
+        <w:pStyle w:val="Prrafodelista"/>
+        <w:ind w:left="1440" w:firstLine="0"/>
+        <w:rPr>
+          <w:lang w:val="en-US"/>
+        </w:rPr>
+      </w:pPr>
+      <w:r>
+        <w:t xml:space="preserve">    </w:t>
+      </w:r>
+      <w:proofErr w:type="spellStart"/>
+      <w:r>
+        <w:rPr>
+          <w:lang w:val="en-US"/>
+        </w:rPr>
+        <w:t>id_usuario</w:t>
+      </w:r>
+      <w:proofErr w:type="spellEnd"/>
+      <w:r>
+        <w:rPr>
+          <w:lang w:val="en-US"/>
+        </w:rPr>
+        <w:t xml:space="preserve"> INT NOT NULL,</w:t>
+      </w:r>
+    </w:p>
+    <w:p>
+      <w:pPr>
+        <w:pStyle w:val="Prrafodelista"/>
+        <w:ind w:left="1440" w:firstLine="0"/>
+        <w:rPr>
+          <w:lang w:val="en-US"/>
+        </w:rPr>
+      </w:pPr>
+    </w:p>
+    <w:p>
+      <w:pPr>
+        <w:pStyle w:val="Prrafodelista"/>
+        <w:ind w:left="1440" w:firstLine="0"/>
+      </w:pPr>
+      <w:r>
+        <w:rPr>
+          <w:lang w:val="en-US"/>
+        </w:rPr>
+        <w:t xml:space="preserve">    </w:t>
+      </w:r>
+      <w:r>
+        <w:t>--- Fecha y hora exacta en que ocurrió el evento</w:t>
+      </w:r>
+    </w:p>
+    <w:p>
+      <w:pPr>
+        <w:pStyle w:val="Prrafodelista"/>
+        <w:ind w:left="1440" w:firstLine="0"/>
+      </w:pPr>
+      <w:r>
+        <w:t xml:space="preserve">    fecha DATETIME DEFAULT CURRENT_TIMESTAMP</w:t>
+      </w:r>
+    </w:p>
+    <w:p>
+      <w:pPr>
+        <w:rPr>
+          <w:lang w:val="es-US"/>
+        </w:rPr>
+      </w:pPr>
+      <w:r>
+        <w:t xml:space="preserve">); y teniendo estos campos para mostrar el historial ahí, luego debajo de esto aparece el </w:t>
+      </w:r>
+      <w:proofErr w:type="spellStart"/>
+      <w:r>
+        <w:t>aparteado</w:t>
+      </w:r>
+      <w:proofErr w:type="spellEnd"/>
+      <w:r>
+        <w:t xml:space="preserve"> de pagos y documentos donde estarán todos los </w:t>
+      </w:r>
+      <w:proofErr w:type="spellStart"/>
+      <w:r>
+        <w:t>docuemtnos</w:t>
+      </w:r>
+      <w:proofErr w:type="spellEnd"/>
+      <w:r>
+        <w:t xml:space="preserve"> emitidos ya se </w:t>
+      </w:r>
+      <w:proofErr w:type="spellStart"/>
+      <w:r>
+        <w:t>vaucher</w:t>
+      </w:r>
+      <w:proofErr w:type="spellEnd"/>
+      <w:r>
+        <w:t xml:space="preserve">, o boleta o factura, </w:t>
+      </w:r>
+      <w:r>
+        <w:t xml:space="preserve">en una lista o tabla, y </w:t>
+      </w:r>
+      <w:proofErr w:type="spellStart"/>
+      <w:r>
+        <w:t>asu</w:t>
+      </w:r>
+      <w:proofErr w:type="spellEnd"/>
+      <w:r>
+        <w:t xml:space="preserve"> costado debe estar lo </w:t>
+      </w:r>
+      <w:proofErr w:type="spellStart"/>
+      <w:r>
+        <w:t>sbotones</w:t>
+      </w:r>
+      <w:proofErr w:type="spellEnd"/>
+      <w:r>
+        <w:t xml:space="preserve"> de enviar o de </w:t>
+      </w:r>
+      <w:proofErr w:type="spellStart"/>
+      <w:r>
+        <w:t>imrimir</w:t>
+      </w:r>
+      <w:proofErr w:type="spellEnd"/>
+      <w:r>
+        <w:t xml:space="preserve">, el cual al dar </w:t>
+      </w:r>
+      <w:proofErr w:type="spellStart"/>
+      <w:r>
+        <w:t>click</w:t>
+      </w:r>
+      <w:proofErr w:type="spellEnd"/>
+      <w:r>
+        <w:t xml:space="preserve"> en enviar, me aparecerá una confirmación primero como tengo la librería de </w:t>
+      </w:r>
+      <w:r>
+        <w:t>sweetalert2</w:t>
+      </w:r>
+      <w:r>
+        <w:t xml:space="preserve"> utilizarla esta y dentro me </w:t>
+      </w:r>
+      <w:proofErr w:type="spellStart"/>
+      <w:r>
+        <w:t>aprezca</w:t>
+      </w:r>
+      <w:proofErr w:type="spellEnd"/>
+      <w:r>
+        <w:t xml:space="preserve"> un </w:t>
+      </w:r>
+      <w:proofErr w:type="spellStart"/>
+      <w:r>
+        <w:t>imnput</w:t>
+      </w:r>
+      <w:proofErr w:type="spellEnd"/>
+      <w:r>
+        <w:t xml:space="preserve"> con el correo del cliente, por siquiera modificarla y al dar enviar se enviara a su correo, y al </w:t>
+      </w:r>
+      <w:proofErr w:type="spellStart"/>
+      <w:r>
+        <w:t>dark</w:t>
+      </w:r>
+      <w:proofErr w:type="spellEnd"/>
+      <w:r>
+        <w:t xml:space="preserve"> </w:t>
+      </w:r>
+      <w:proofErr w:type="spellStart"/>
+      <w:r>
+        <w:t>click</w:t>
+      </w:r>
+      <w:proofErr w:type="spellEnd"/>
+      <w:r>
+        <w:t xml:space="preserve"> me aparecerá la opción de imprimir y confirmamos he imprimimos. </w:t>
+      </w:r>
+    </w:p>
+    <w:p>
+      <w:pPr>
+        <w:pStyle w:val="Prrafodelista"/>
+        <w:numPr>
+          <w:ilvl w:val="0"/>
+          <w:numId w:val="2"/>
+        </w:numPr>
+        <w:rPr>
+          <w:lang w:val="es-US"/>
+        </w:rPr>
+      </w:pPr>
+      <w:proofErr w:type="spellStart"/>
+      <w:r>
+        <w:rPr>
+          <w:lang w:val="es-US"/>
+        </w:rPr>
+        <w:t>Eliminasmois</w:t>
+      </w:r>
+      <w:proofErr w:type="spellEnd"/>
+      <w:r>
+        <w:rPr>
+          <w:lang w:val="es-US"/>
+        </w:rPr>
+        <w:t xml:space="preserve"> la columna Total </w:t>
+      </w:r>
+    </w:p>
+    <w:p>
+      <w:pPr>
+        <w:pStyle w:val="Prrafodelista"/>
+        <w:numPr>
+          <w:ilvl w:val="0"/>
+          <w:numId w:val="2"/>
+        </w:numPr>
+        <w:rPr>
+          <w:lang w:val="es-US"/>
+        </w:rPr>
+      </w:pPr>
+      <w:proofErr w:type="gramStart"/>
+      <w:r>
+        <w:rPr>
+          <w:lang w:val="es-US"/>
+        </w:rPr>
+        <w:t>Ordenar  tabla</w:t>
+      </w:r>
+      <w:proofErr w:type="gramEnd"/>
+      <w:r>
+        <w:rPr>
+          <w:lang w:val="es-US"/>
+        </w:rPr>
+        <w:t xml:space="preserve"> por primero en </w:t>
+      </w:r>
+      <w:proofErr w:type="spellStart"/>
+      <w:proofErr w:type="gramStart"/>
+      <w:r>
+        <w:rPr>
+          <w:lang w:val="es-US"/>
+        </w:rPr>
+        <w:t>estadia</w:t>
+      </w:r>
+      <w:proofErr w:type="spellEnd"/>
+      <w:r>
+        <w:rPr>
+          <w:lang w:val="es-US"/>
+        </w:rPr>
+        <w:t xml:space="preserve"> ,</w:t>
+      </w:r>
+      <w:proofErr w:type="gramEnd"/>
+      <w:r>
+        <w:rPr>
+          <w:lang w:val="es-US"/>
+        </w:rPr>
+        <w:t xml:space="preserve"> </w:t>
+      </w:r>
+      <w:proofErr w:type="spellStart"/>
+      <w:r>
+        <w:rPr>
+          <w:lang w:val="es-US"/>
+        </w:rPr>
+        <w:t>check</w:t>
+      </w:r>
+      <w:proofErr w:type="spellEnd"/>
+      <w:r>
+        <w:rPr>
+          <w:lang w:val="es-US"/>
+        </w:rPr>
+        <w:t xml:space="preserve"> in hoy y luego futuras</w:t>
+      </w:r>
+    </w:p>
+    <w:p>
+      <w:pPr>
+        <w:pStyle w:val="Prrafodelista"/>
+        <w:numPr>
+          <w:ilvl w:val="0"/>
+          <w:numId w:val="2"/>
+        </w:numPr>
+        <w:rPr>
+          <w:lang w:val="es-US"/>
+        </w:rPr>
+      </w:pPr>
+      <w:r>
+        <w:rPr>
+          <w:lang w:val="es-US"/>
+        </w:rPr>
+        <w:t>Pendiente, crear una reserva historial en la navegación y podemos reutilizar reserva</w:t>
+      </w:r>
+    </w:p>
+    <w:p>
+      <w:pPr>
+        <w:pStyle w:val="Prrafodelista"/>
+        <w:numPr>
+          <w:ilvl w:val="0"/>
+          <w:numId w:val="2"/>
+        </w:numPr>
+        <w:rPr>
+          <w:lang w:val="es-US"/>
+        </w:rPr>
+      </w:pPr>
+      <w:r>
+        <w:rPr>
+          <w:lang w:val="es-US"/>
+        </w:rPr>
+        <w:lastRenderedPageBreak/>
+        <w:t xml:space="preserve">Apartado del </w:t>
+      </w:r>
+      <w:proofErr w:type="spellStart"/>
+      <w:r>
+        <w:rPr>
+          <w:lang w:val="es-US"/>
+        </w:rPr>
+        <w:t>filtadro</w:t>
+      </w:r>
+      <w:proofErr w:type="spellEnd"/>
+      <w:r>
+        <w:rPr>
+          <w:lang w:val="es-US"/>
+        </w:rPr>
+        <w:t xml:space="preserve"> el buscar me acepte nombre del cliente, </w:t>
+      </w:r>
+      <w:proofErr w:type="gramStart"/>
+      <w:r>
+        <w:rPr>
+          <w:lang w:val="es-US"/>
+        </w:rPr>
+        <w:t>apellido ,</w:t>
+      </w:r>
+      <w:proofErr w:type="gramEnd"/>
+      <w:r>
+        <w:rPr>
+          <w:lang w:val="es-US"/>
+        </w:rPr>
+        <w:t xml:space="preserve"> </w:t>
+      </w:r>
+      <w:proofErr w:type="spellStart"/>
+      <w:r>
+        <w:rPr>
+          <w:lang w:val="es-US"/>
+        </w:rPr>
+        <w:t>dni</w:t>
+      </w:r>
+      <w:proofErr w:type="spellEnd"/>
+      <w:r>
+        <w:rPr>
+          <w:lang w:val="es-US"/>
+        </w:rPr>
+        <w:t xml:space="preserve"> y código de reserva</w:t>
       </w:r>
     </w:p>
     <w:p>
@@ -320,7 +1241,6 @@
           <w:numId w:val="3"/>
         </w:numPr>
         <w:rPr>
-          <w:color w:val="EE0000"/>
           <w:lang w:val="es-ES"/>
         </w:rPr>
       </w:pPr>
@@ -458,56 +1378,9 @@
       </w:pPr>
       <w:r>
         <w:rPr>
-          <w:lang w:val="es-ES"/>
-        </w:rPr>
-        <w:t xml:space="preserve">Si vamos a mostrar todos los </w:t>
-      </w:r>
-      <w:proofErr w:type="spellStart"/>
-      <w:r>
-        <w:rPr>
-          <w:lang w:val="es-ES"/>
-        </w:rPr>
-        <w:t>ticekts</w:t>
-      </w:r>
-      <w:proofErr w:type="spellEnd"/>
-      <w:r>
-        <w:rPr>
-          <w:lang w:val="es-ES"/>
-        </w:rPr>
-        <w:t xml:space="preserve"> y </w:t>
-      </w:r>
-      <w:proofErr w:type="gramStart"/>
-      <w:r>
-        <w:rPr>
-          <w:lang w:val="es-ES"/>
-        </w:rPr>
-        <w:t>boletas creados</w:t>
-      </w:r>
-      <w:proofErr w:type="gramEnd"/>
-      <w:r>
-        <w:rPr>
-          <w:lang w:val="es-ES"/>
-        </w:rPr>
-        <w:t xml:space="preserve"> </w:t>
-      </w:r>
-    </w:p>
-    <w:p>
-      <w:pPr>
-        <w:pStyle w:val="Prrafodelista"/>
-        <w:numPr>
-          <w:ilvl w:val="0"/>
-          <w:numId w:val="3"/>
-        </w:numPr>
-        <w:rPr>
-          <w:lang w:val="es-ES"/>
-        </w:rPr>
-      </w:pPr>
-      <w:r>
-        <w:rPr>
           <w:noProof/>
           <w:lang w:val="es-ES"/>
         </w:rPr>
-        <w:lastRenderedPageBreak/>
         <w:drawing>
           <wp:inline distT="0" distB="0" distL="0" distR="0" wp14:anchorId="0DD59DE1" wp14:editId="571676E9">
             <wp:extent cx="5430008" cy="5534797"/>
@@ -561,6 +1434,7 @@
           <w:noProof/>
           <w:lang w:val="es-ES"/>
         </w:rPr>
+        <w:lastRenderedPageBreak/>
         <w:drawing>
           <wp:inline distT="0" distB="0" distL="0" distR="0" wp14:anchorId="4AFF9D96" wp14:editId="13621E96">
             <wp:extent cx="5731510" cy="2978150"/>
@@ -614,7 +1488,6 @@
           <w:noProof/>
           <w:lang w:val="es-ES"/>
         </w:rPr>
-        <w:lastRenderedPageBreak/>
         <w:drawing>
           <wp:inline distT="0" distB="0" distL="0" distR="0" wp14:anchorId="68BA502B" wp14:editId="4EA2820C">
             <wp:extent cx="4391638" cy="2181529"/>
@@ -959,11 +1832,285 @@
     <w:p>
       <w:pPr>
         <w:pStyle w:val="Prrafodelista"/>
+        <w:pBdr>
+          <w:bottom w:val="single" w:sz="6" w:space="1" w:color="auto"/>
+        </w:pBdr>
         <w:ind w:firstLine="0"/>
         <w:rPr>
           <w:lang w:val="es-ES"/>
         </w:rPr>
       </w:pPr>
+    </w:p>
+    <w:p>
+      <w:pPr>
+        <w:pStyle w:val="Prrafodelista"/>
+        <w:ind w:firstLine="0"/>
+        <w:rPr>
+          <w:lang w:val="es-ES"/>
+        </w:rPr>
+      </w:pPr>
+      <w:r>
+        <w:rPr>
+          <w:lang w:val="es-ES"/>
+        </w:rPr>
+        <w:t xml:space="preserve">Enel ultimo </w:t>
+      </w:r>
+      <w:proofErr w:type="spellStart"/>
+      <w:r>
+        <w:rPr>
+          <w:lang w:val="es-ES"/>
+        </w:rPr>
+        <w:t>merge</w:t>
+      </w:r>
+      <w:proofErr w:type="spellEnd"/>
+      <w:r>
+        <w:rPr>
+          <w:lang w:val="es-ES"/>
+        </w:rPr>
+        <w:t xml:space="preserve"> </w:t>
+      </w:r>
+      <w:proofErr w:type="spellStart"/>
+      <w:r>
+        <w:rPr>
+          <w:lang w:val="es-ES"/>
+        </w:rPr>
+        <w:t>qu</w:t>
+      </w:r>
+      <w:proofErr w:type="spellEnd"/>
+      <w:r>
+        <w:rPr>
+          <w:lang w:val="es-ES"/>
+        </w:rPr>
+        <w:t xml:space="preserve"> </w:t>
+      </w:r>
+      <w:proofErr w:type="spellStart"/>
+      <w:r>
+        <w:rPr>
+          <w:lang w:val="es-ES"/>
+        </w:rPr>
+        <w:t>ehec</w:t>
+      </w:r>
+      <w:proofErr w:type="spellEnd"/>
+      <w:r>
+        <w:rPr>
+          <w:lang w:val="es-ES"/>
+        </w:rPr>
+        <w:t xml:space="preserve"> me recomendaron esto </w:t>
+      </w:r>
+    </w:p>
+    <w:p>
+      <w:pPr>
+        <w:pStyle w:val="Prrafodelista"/>
+        <w:numPr>
+          <w:ilvl w:val="0"/>
+          <w:numId w:val="6"/>
+        </w:numPr>
+        <w:rPr>
+          <w:lang w:val="es-ES"/>
+        </w:rPr>
+      </w:pPr>
+      <w:r>
+        <w:t>Se omite la comprobación de disponibilidad para las habitaciones que ya están asignadas a esta reserva. Si la edición cambia las fechas de entrada/salida, esa misma habitación ahora puede superponerse a otra reserva activa sin ser detectada. Valide cada habitación seleccionada con el ID de reserva actual excluido, en lugar de omitir las habitaciones que ya están en la reserva.</w:t>
+      </w:r>
+    </w:p>
+    <w:p>
+      <w:pPr>
+        <w:pStyle w:val="Prrafodelista"/>
+        <w:ind w:firstLine="0"/>
+        <w:rPr>
+          <w:lang w:val="es-ES"/>
+        </w:rPr>
+      </w:pPr>
+      <w:r>
+        <w:rPr>
+          <w:noProof/>
+          <w:lang w:val="es-ES"/>
+        </w:rPr>
+        <w:drawing>
+          <wp:inline distT="0" distB="0" distL="0" distR="0" wp14:anchorId="39431AF7" wp14:editId="78B22A89">
+            <wp:extent cx="5731510" cy="2574290"/>
+            <wp:effectExtent l="0" t="0" r="2540" b="0"/>
+            <wp:docPr id="261758630" name="Imagen 1"/>
+            <wp:cNvGraphicFramePr>
+              <a:graphicFrameLocks xmlns:a="http://schemas.openxmlformats.org/drawingml/2006/main" noChangeAspect="1"/>
+            </wp:cNvGraphicFramePr>
+            <a:graphic xmlns:a="http://schemas.openxmlformats.org/drawingml/2006/main">
+              <a:graphicData uri="http://schemas.openxmlformats.org/drawingml/2006/picture">
+                <pic:pic xmlns:pic="http://schemas.openxmlformats.org/drawingml/2006/picture">
+                  <pic:nvPicPr>
+                    <pic:cNvPr id="261758630" name=""/>
+                    <pic:cNvPicPr/>
+                  </pic:nvPicPr>
+                  <pic:blipFill>
+                    <a:blip r:embed="rId10"/>
+                    <a:stretch>
+                      <a:fillRect/>
+                    </a:stretch>
+                  </pic:blipFill>
+                  <pic:spPr>
+                    <a:xfrm>
+                      <a:off x="0" y="0"/>
+                      <a:ext cx="5731510" cy="2574290"/>
+                    </a:xfrm>
+                    <a:prstGeom prst="rect">
+                      <a:avLst/>
+                    </a:prstGeom>
+                  </pic:spPr>
+                </pic:pic>
+              </a:graphicData>
+            </a:graphic>
+          </wp:inline>
+        </w:drawing>
+      </w:r>
+    </w:p>
+    <w:p>
+      <w:pPr>
+        <w:pStyle w:val="Prrafodelista"/>
+        <w:numPr>
+          <w:ilvl w:val="0"/>
+          <w:numId w:val="6"/>
+        </w:numPr>
+        <w:rPr>
+          <w:lang w:val="es-ES"/>
+        </w:rPr>
+      </w:pPr>
+      <w:r>
+        <w:rPr>
+          <w:noProof/>
+          <w:lang w:val="es-ES"/>
+        </w:rPr>
+        <w:drawing>
+          <wp:inline distT="0" distB="0" distL="0" distR="0" wp14:anchorId="33C24B5E" wp14:editId="3F839EF1">
+            <wp:extent cx="5731510" cy="2788285"/>
+            <wp:effectExtent l="0" t="0" r="2540" b="0"/>
+            <wp:docPr id="1636264111" name="Imagen 1"/>
+            <wp:cNvGraphicFramePr>
+              <a:graphicFrameLocks xmlns:a="http://schemas.openxmlformats.org/drawingml/2006/main" noChangeAspect="1"/>
+            </wp:cNvGraphicFramePr>
+            <a:graphic xmlns:a="http://schemas.openxmlformats.org/drawingml/2006/main">
+              <a:graphicData uri="http://schemas.openxmlformats.org/drawingml/2006/picture">
+                <pic:pic xmlns:pic="http://schemas.openxmlformats.org/drawingml/2006/picture">
+                  <pic:nvPicPr>
+                    <pic:cNvPr id="1636264111" name=""/>
+                    <pic:cNvPicPr/>
+                  </pic:nvPicPr>
+                  <pic:blipFill>
+                    <a:blip r:embed="rId11"/>
+                    <a:stretch>
+                      <a:fillRect/>
+                    </a:stretch>
+                  </pic:blipFill>
+                  <pic:spPr>
+                    <a:xfrm>
+                      <a:off x="0" y="0"/>
+                      <a:ext cx="5731510" cy="2788285"/>
+                    </a:xfrm>
+                    <a:prstGeom prst="rect">
+                      <a:avLst/>
+                    </a:prstGeom>
+                  </pic:spPr>
+                </pic:pic>
+              </a:graphicData>
+            </a:graphic>
+          </wp:inline>
+        </w:drawing>
+      </w:r>
+    </w:p>
+    <w:p>
+      <w:pPr>
+        <w:pStyle w:val="Prrafodelista"/>
+        <w:numPr>
+          <w:ilvl w:val="0"/>
+          <w:numId w:val="6"/>
+        </w:numPr>
+        <w:rPr>
+          <w:lang w:val="es-ES"/>
+        </w:rPr>
+      </w:pPr>
+      <w:r>
+        <w:rPr>
+          <w:noProof/>
+          <w:lang w:val="es-ES"/>
+        </w:rPr>
+        <w:lastRenderedPageBreak/>
+        <w:drawing>
+          <wp:inline distT="0" distB="0" distL="0" distR="0" wp14:anchorId="00A2CD29" wp14:editId="7A2117AC">
+            <wp:extent cx="5731510" cy="4829810"/>
+            <wp:effectExtent l="0" t="0" r="2540" b="8890"/>
+            <wp:docPr id="1831048380" name="Imagen 1"/>
+            <wp:cNvGraphicFramePr>
+              <a:graphicFrameLocks xmlns:a="http://schemas.openxmlformats.org/drawingml/2006/main" noChangeAspect="1"/>
+            </wp:cNvGraphicFramePr>
+            <a:graphic xmlns:a="http://schemas.openxmlformats.org/drawingml/2006/main">
+              <a:graphicData uri="http://schemas.openxmlformats.org/drawingml/2006/picture">
+                <pic:pic xmlns:pic="http://schemas.openxmlformats.org/drawingml/2006/picture">
+                  <pic:nvPicPr>
+                    <pic:cNvPr id="1831048380" name=""/>
+                    <pic:cNvPicPr/>
+                  </pic:nvPicPr>
+                  <pic:blipFill>
+                    <a:blip r:embed="rId12"/>
+                    <a:stretch>
+                      <a:fillRect/>
+                    </a:stretch>
+                  </pic:blipFill>
+                  <pic:spPr>
+                    <a:xfrm>
+                      <a:off x="0" y="0"/>
+                      <a:ext cx="5731510" cy="4829810"/>
+                    </a:xfrm>
+                    <a:prstGeom prst="rect">
+                      <a:avLst/>
+                    </a:prstGeom>
+                  </pic:spPr>
+                </pic:pic>
+              </a:graphicData>
+            </a:graphic>
+          </wp:inline>
+        </w:drawing>
+      </w:r>
+      <w:r>
+        <w:rPr>
+          <w:noProof/>
+          <w:lang w:val="es-ES"/>
+        </w:rPr>
+        <w:lastRenderedPageBreak/>
+        <w:drawing>
+          <wp:inline distT="0" distB="0" distL="0" distR="0" wp14:anchorId="7DD2D590" wp14:editId="72295448">
+            <wp:extent cx="5731510" cy="4191000"/>
+            <wp:effectExtent l="0" t="0" r="2540" b="0"/>
+            <wp:docPr id="1588003803" name="Imagen 1"/>
+            <wp:cNvGraphicFramePr>
+              <a:graphicFrameLocks xmlns:a="http://schemas.openxmlformats.org/drawingml/2006/main" noChangeAspect="1"/>
+            </wp:cNvGraphicFramePr>
+            <a:graphic xmlns:a="http://schemas.openxmlformats.org/drawingml/2006/main">
+              <a:graphicData uri="http://schemas.openxmlformats.org/drawingml/2006/picture">
+                <pic:pic xmlns:pic="http://schemas.openxmlformats.org/drawingml/2006/picture">
+                  <pic:nvPicPr>
+                    <pic:cNvPr id="1588003803" name=""/>
+                    <pic:cNvPicPr/>
+                  </pic:nvPicPr>
+                  <pic:blipFill>
+                    <a:blip r:embed="rId13"/>
+                    <a:stretch>
+                      <a:fillRect/>
+                    </a:stretch>
+                  </pic:blipFill>
+                  <pic:spPr>
+                    <a:xfrm>
+                      <a:off x="0" y="0"/>
+                      <a:ext cx="5731510" cy="4191000"/>
+                    </a:xfrm>
+                    <a:prstGeom prst="rect">
+                      <a:avLst/>
+                    </a:prstGeom>
+                  </pic:spPr>
+                </pic:pic>
+              </a:graphicData>
+            </a:graphic>
+          </wp:inline>
+        </w:drawing>
+      </w:r>
     </w:p>
     <w:sectPr>
       <w:pgSz w:w="11906" w:h="16838"/>
@@ -1204,6 +2351,92 @@
     </w:lvl>
   </w:abstractNum>
   <w:abstractNum w:abstractNumId="2" w15:restartNumberingAfterBreak="0">
+    <w:nsid w:val="3AE21CD3"/>
+    <w:multiLevelType w:val="hybridMultilevel"/>
+    <w:tmpl w:val="E410C554"/>
+    <w:lvl w:ilvl="0" w:tplc="FFFFFFFF">
+      <w:start w:val="1"/>
+      <w:numFmt w:val="decimal"/>
+      <w:lvlText w:val="%1."/>
+      <w:lvlJc w:val="left"/>
+      <w:pPr>
+        <w:ind w:left="720" w:hanging="360"/>
+      </w:pPr>
+    </w:lvl>
+    <w:lvl w:ilvl="1" w:tplc="FFFFFFFF" w:tentative="1">
+      <w:start w:val="1"/>
+      <w:numFmt w:val="lowerLetter"/>
+      <w:lvlText w:val="%2."/>
+      <w:lvlJc w:val="left"/>
+      <w:pPr>
+        <w:ind w:left="1440" w:hanging="360"/>
+      </w:pPr>
+    </w:lvl>
+    <w:lvl w:ilvl="2" w:tplc="FFFFFFFF" w:tentative="1">
+      <w:start w:val="1"/>
+      <w:numFmt w:val="lowerRoman"/>
+      <w:lvlText w:val="%3."/>
+      <w:lvlJc w:val="right"/>
+      <w:pPr>
+        <w:ind w:left="2160" w:hanging="180"/>
+      </w:pPr>
+    </w:lvl>
+    <w:lvl w:ilvl="3" w:tplc="FFFFFFFF" w:tentative="1">
+      <w:start w:val="1"/>
+      <w:numFmt w:val="decimal"/>
+      <w:lvlText w:val="%4."/>
+      <w:lvlJc w:val="left"/>
+      <w:pPr>
+        <w:ind w:left="2880" w:hanging="360"/>
+      </w:pPr>
+    </w:lvl>
+    <w:lvl w:ilvl="4" w:tplc="FFFFFFFF" w:tentative="1">
+      <w:start w:val="1"/>
+      <w:numFmt w:val="lowerLetter"/>
+      <w:lvlText w:val="%5."/>
+      <w:lvlJc w:val="left"/>
+      <w:pPr>
+        <w:ind w:left="3600" w:hanging="360"/>
+      </w:pPr>
+    </w:lvl>
+    <w:lvl w:ilvl="5" w:tplc="FFFFFFFF" w:tentative="1">
+      <w:start w:val="1"/>
+      <w:numFmt w:val="lowerRoman"/>
+      <w:lvlText w:val="%6."/>
+      <w:lvlJc w:val="right"/>
+      <w:pPr>
+        <w:ind w:left="4320" w:hanging="180"/>
+      </w:pPr>
+    </w:lvl>
+    <w:lvl w:ilvl="6" w:tplc="FFFFFFFF" w:tentative="1">
+      <w:start w:val="1"/>
+      <w:numFmt w:val="decimal"/>
+      <w:lvlText w:val="%7."/>
+      <w:lvlJc w:val="left"/>
+      <w:pPr>
+        <w:ind w:left="5040" w:hanging="360"/>
+      </w:pPr>
+    </w:lvl>
+    <w:lvl w:ilvl="7" w:tplc="FFFFFFFF" w:tentative="1">
+      <w:start w:val="1"/>
+      <w:numFmt w:val="lowerLetter"/>
+      <w:lvlText w:val="%8."/>
+      <w:lvlJc w:val="left"/>
+      <w:pPr>
+        <w:ind w:left="5760" w:hanging="360"/>
+      </w:pPr>
+    </w:lvl>
+    <w:lvl w:ilvl="8" w:tplc="FFFFFFFF" w:tentative="1">
+      <w:start w:val="1"/>
+      <w:numFmt w:val="lowerRoman"/>
+      <w:lvlText w:val="%9."/>
+      <w:lvlJc w:val="right"/>
+      <w:pPr>
+        <w:ind w:left="6480" w:hanging="180"/>
+      </w:pPr>
+    </w:lvl>
+  </w:abstractNum>
+  <w:abstractNum w:abstractNumId="3" w15:restartNumberingAfterBreak="0">
     <w:nsid w:val="45D243DA"/>
     <w:multiLevelType w:val="hybridMultilevel"/>
     <w:tmpl w:val="8F646810"/>
@@ -1292,7 +2525,7 @@
       </w:pPr>
     </w:lvl>
   </w:abstractNum>
-  <w:abstractNum w:abstractNumId="3" w15:restartNumberingAfterBreak="0">
+  <w:abstractNum w:abstractNumId="4" w15:restartNumberingAfterBreak="0">
     <w:nsid w:val="50A91808"/>
     <w:multiLevelType w:val="hybridMultilevel"/>
     <w:tmpl w:val="54A2373E"/>
@@ -1405,10 +2638,10 @@
       </w:rPr>
     </w:lvl>
   </w:abstractNum>
-  <w:abstractNum w:abstractNumId="4" w15:restartNumberingAfterBreak="0">
+  <w:abstractNum w:abstractNumId="5" w15:restartNumberingAfterBreak="0">
     <w:nsid w:val="732D4D23"/>
     <w:multiLevelType w:val="hybridMultilevel"/>
-    <w:tmpl w:val="FADA3918"/>
+    <w:tmpl w:val="2822017E"/>
     <w:lvl w:ilvl="0" w:tplc="0C0A000F">
       <w:start w:val="1"/>
       <w:numFmt w:val="decimal"/>
@@ -1492,7 +2725,7 @@
     </w:lvl>
   </w:abstractNum>
   <w:num w:numId="1" w16cid:durableId="787891419">
-    <w:abstractNumId w:val="2"/>
+    <w:abstractNumId w:val="3"/>
   </w:num>
   <w:num w:numId="2" w16cid:durableId="697895822">
     <w:abstractNumId w:val="0"/>
@@ -1501,10 +2734,13 @@
     <w:abstractNumId w:val="1"/>
   </w:num>
   <w:num w:numId="4" w16cid:durableId="1680424255">
-    <w:abstractNumId w:val="3"/>
+    <w:abstractNumId w:val="4"/>
   </w:num>
   <w:num w:numId="5" w16cid:durableId="2100365675">
-    <w:abstractNumId w:val="4"/>
+    <w:abstractNumId w:val="5"/>
+  </w:num>
+  <w:num w:numId="6" w16cid:durableId="179854130">
+    <w:abstractNumId w:val="2"/>
   </w:num>
 </w:numbering>
 </file>
@@ -2116,7 +3352,6 @@
   <w:style w:type="character" w:default="1" w:styleId="Fuentedeprrafopredeter">
     <w:name w:val="Default Paragraph Font"/>
     <w:uiPriority w:val="1"/>
-    <w:semiHidden/>
     <w:unhideWhenUsed/>
   </w:style>
   <w:style w:type="table" w:default="1" w:styleId="Tablanormal">

</xml_diff>